<commit_message>
added a settings navbar and a delete attendance button to delete all the generated docx
</commit_message>
<xml_diff>
--- a/template/DTR.docx
+++ b/template/DTR.docx
@@ -135,16 +135,27 @@
           <w:szCs w:val="20"/>
           <w:u w:val="single"/>
         </w:rPr>
-        <w:t>{year}</w:t>
+        <w:t>{</w:t>
       </w:r>
+      <w:proofErr w:type="gramStart"/>
       <w:r>
         <w:rPr>
           <w:b/>
           <w:sz w:val="20"/>
           <w:szCs w:val="20"/>
+          <w:u w:val="single"/>
+        </w:rPr>
+        <w:t>year}</w:t>
+      </w:r>
+      <w:r>
+        <w:rPr>
+          <w:b/>
+          <w:sz w:val="20"/>
+          <w:szCs w:val="20"/>
         </w:rPr>
         <w:t xml:space="preserve">   </w:t>
       </w:r>
+      <w:proofErr w:type="gramEnd"/>
       <w:r>
         <w:rPr>
           <w:sz w:val="20"/>
@@ -220,7 +231,7 @@
     </w:p>
     <w:tbl>
       <w:tblPr>
-        <w:tblW w:w="5292" w:type="dxa"/>
+        <w:tblW w:w="5226" w:type="dxa"/>
         <w:jc w:val="center"/>
         <w:tblBorders>
           <w:top w:val="single" w:sz="6" w:space="0" w:color="000000"/>
@@ -240,7 +251,7 @@
         <w:gridCol w:w="785"/>
         <w:gridCol w:w="851"/>
         <w:gridCol w:w="661"/>
-        <w:gridCol w:w="602"/>
+        <w:gridCol w:w="536"/>
       </w:tblGrid>
       <w:tr>
         <w:trPr>
@@ -316,6 +327,7 @@
                 <w:szCs w:val="22"/>
               </w:rPr>
             </w:pPr>
+            <w:proofErr w:type="spellStart"/>
             <w:r>
               <w:rPr>
                 <w:sz w:val="22"/>
@@ -323,6 +335,7 @@
               </w:rPr>
               <w:t>Depar</w:t>
             </w:r>
+            <w:proofErr w:type="spellEnd"/>
           </w:p>
           <w:p>
             <w:pPr>
@@ -332,6 +345,7 @@
                 <w:szCs w:val="22"/>
               </w:rPr>
             </w:pPr>
+            <w:proofErr w:type="spellStart"/>
             <w:r>
               <w:rPr>
                 <w:sz w:val="22"/>
@@ -339,6 +353,7 @@
               </w:rPr>
               <w:t>ture</w:t>
             </w:r>
+            <w:proofErr w:type="spellEnd"/>
           </w:p>
         </w:tc>
         <w:tc>
@@ -384,6 +399,7 @@
                 <w:szCs w:val="22"/>
               </w:rPr>
             </w:pPr>
+            <w:proofErr w:type="spellStart"/>
             <w:r>
               <w:rPr>
                 <w:sz w:val="22"/>
@@ -391,6 +407,7 @@
               </w:rPr>
               <w:t>Depar</w:t>
             </w:r>
+            <w:proofErr w:type="spellEnd"/>
           </w:p>
           <w:p>
             <w:pPr>
@@ -400,6 +417,7 @@
                 <w:szCs w:val="22"/>
               </w:rPr>
             </w:pPr>
+            <w:proofErr w:type="spellStart"/>
             <w:r>
               <w:rPr>
                 <w:sz w:val="22"/>
@@ -407,6 +425,7 @@
               </w:rPr>
               <w:t>ture</w:t>
             </w:r>
+            <w:proofErr w:type="spellEnd"/>
           </w:p>
         </w:tc>
         <w:tc>
@@ -437,7 +456,7 @@
         </w:tc>
         <w:tc>
           <w:tcPr>
-            <w:tcW w:w="602" w:type="dxa"/>
+            <w:tcW w:w="536" w:type="dxa"/>
             <w:noWrap/>
             <w:tcMar>
               <w:left w:w="29" w:type="dxa"/>
@@ -554,7 +573,7 @@
         </w:tc>
         <w:tc>
           <w:tcPr>
-            <w:tcW w:w="602" w:type="dxa"/>
+            <w:tcW w:w="536" w:type="dxa"/>
           </w:tcPr>
           <w:p>
             <w:pPr>
@@ -658,7 +677,7 @@
         </w:tc>
         <w:tc>
           <w:tcPr>
-            <w:tcW w:w="602" w:type="dxa"/>
+            <w:tcW w:w="536" w:type="dxa"/>
           </w:tcPr>
           <w:p>
             <w:pPr>
@@ -762,7 +781,7 @@
         </w:tc>
         <w:tc>
           <w:tcPr>
-            <w:tcW w:w="602" w:type="dxa"/>
+            <w:tcW w:w="536" w:type="dxa"/>
           </w:tcPr>
           <w:p>
             <w:pPr>
@@ -866,7 +885,7 @@
         </w:tc>
         <w:tc>
           <w:tcPr>
-            <w:tcW w:w="602" w:type="dxa"/>
+            <w:tcW w:w="536" w:type="dxa"/>
           </w:tcPr>
           <w:p>
             <w:pPr>
@@ -970,7 +989,7 @@
         </w:tc>
         <w:tc>
           <w:tcPr>
-            <w:tcW w:w="602" w:type="dxa"/>
+            <w:tcW w:w="536" w:type="dxa"/>
           </w:tcPr>
           <w:p>
             <w:pPr>
@@ -1074,7 +1093,7 @@
         </w:tc>
         <w:tc>
           <w:tcPr>
-            <w:tcW w:w="602" w:type="dxa"/>
+            <w:tcW w:w="536" w:type="dxa"/>
           </w:tcPr>
           <w:p>
             <w:pPr>
@@ -1178,7 +1197,7 @@
         </w:tc>
         <w:tc>
           <w:tcPr>
-            <w:tcW w:w="602" w:type="dxa"/>
+            <w:tcW w:w="536" w:type="dxa"/>
           </w:tcPr>
           <w:p>
             <w:pPr>
@@ -1282,7 +1301,7 @@
         </w:tc>
         <w:tc>
           <w:tcPr>
-            <w:tcW w:w="602" w:type="dxa"/>
+            <w:tcW w:w="536" w:type="dxa"/>
           </w:tcPr>
           <w:p>
             <w:pPr>
@@ -1386,7 +1405,7 @@
         </w:tc>
         <w:tc>
           <w:tcPr>
-            <w:tcW w:w="602" w:type="dxa"/>
+            <w:tcW w:w="536" w:type="dxa"/>
           </w:tcPr>
           <w:p>
             <w:pPr>
@@ -1490,7 +1509,7 @@
         </w:tc>
         <w:tc>
           <w:tcPr>
-            <w:tcW w:w="602" w:type="dxa"/>
+            <w:tcW w:w="536" w:type="dxa"/>
           </w:tcPr>
           <w:p>
             <w:pPr>
@@ -1594,7 +1613,7 @@
         </w:tc>
         <w:tc>
           <w:tcPr>
-            <w:tcW w:w="602" w:type="dxa"/>
+            <w:tcW w:w="536" w:type="dxa"/>
           </w:tcPr>
           <w:p>
             <w:pPr>
@@ -1698,7 +1717,7 @@
         </w:tc>
         <w:tc>
           <w:tcPr>
-            <w:tcW w:w="602" w:type="dxa"/>
+            <w:tcW w:w="536" w:type="dxa"/>
           </w:tcPr>
           <w:p>
             <w:pPr>
@@ -1802,7 +1821,7 @@
         </w:tc>
         <w:tc>
           <w:tcPr>
-            <w:tcW w:w="602" w:type="dxa"/>
+            <w:tcW w:w="536" w:type="dxa"/>
           </w:tcPr>
           <w:p>
             <w:pPr>
@@ -1906,7 +1925,7 @@
         </w:tc>
         <w:tc>
           <w:tcPr>
-            <w:tcW w:w="602" w:type="dxa"/>
+            <w:tcW w:w="536" w:type="dxa"/>
           </w:tcPr>
           <w:p>
             <w:pPr>
@@ -2010,7 +2029,7 @@
         </w:tc>
         <w:tc>
           <w:tcPr>
-            <w:tcW w:w="602" w:type="dxa"/>
+            <w:tcW w:w="536" w:type="dxa"/>
           </w:tcPr>
           <w:p>
             <w:pPr>
@@ -2114,7 +2133,7 @@
         </w:tc>
         <w:tc>
           <w:tcPr>
-            <w:tcW w:w="602" w:type="dxa"/>
+            <w:tcW w:w="536" w:type="dxa"/>
           </w:tcPr>
           <w:p>
             <w:pPr>
@@ -2218,7 +2237,7 @@
         </w:tc>
         <w:tc>
           <w:tcPr>
-            <w:tcW w:w="602" w:type="dxa"/>
+            <w:tcW w:w="536" w:type="dxa"/>
           </w:tcPr>
           <w:p>
             <w:pPr>
@@ -2322,7 +2341,7 @@
         </w:tc>
         <w:tc>
           <w:tcPr>
-            <w:tcW w:w="602" w:type="dxa"/>
+            <w:tcW w:w="536" w:type="dxa"/>
           </w:tcPr>
           <w:p>
             <w:pPr>
@@ -2426,7 +2445,7 @@
         </w:tc>
         <w:tc>
           <w:tcPr>
-            <w:tcW w:w="602" w:type="dxa"/>
+            <w:tcW w:w="536" w:type="dxa"/>
           </w:tcPr>
           <w:p>
             <w:pPr>
@@ -2530,7 +2549,7 @@
         </w:tc>
         <w:tc>
           <w:tcPr>
-            <w:tcW w:w="602" w:type="dxa"/>
+            <w:tcW w:w="536" w:type="dxa"/>
           </w:tcPr>
           <w:p>
             <w:pPr>
@@ -2634,7 +2653,7 @@
         </w:tc>
         <w:tc>
           <w:tcPr>
-            <w:tcW w:w="602" w:type="dxa"/>
+            <w:tcW w:w="536" w:type="dxa"/>
           </w:tcPr>
           <w:p>
             <w:pPr>
@@ -2738,7 +2757,7 @@
         </w:tc>
         <w:tc>
           <w:tcPr>
-            <w:tcW w:w="602" w:type="dxa"/>
+            <w:tcW w:w="536" w:type="dxa"/>
           </w:tcPr>
           <w:p>
             <w:pPr>
@@ -2842,7 +2861,7 @@
         </w:tc>
         <w:tc>
           <w:tcPr>
-            <w:tcW w:w="602" w:type="dxa"/>
+            <w:tcW w:w="536" w:type="dxa"/>
           </w:tcPr>
           <w:p>
             <w:pPr>
@@ -2946,7 +2965,7 @@
         </w:tc>
         <w:tc>
           <w:tcPr>
-            <w:tcW w:w="602" w:type="dxa"/>
+            <w:tcW w:w="536" w:type="dxa"/>
           </w:tcPr>
           <w:p>
             <w:pPr>
@@ -3050,7 +3069,7 @@
         </w:tc>
         <w:tc>
           <w:tcPr>
-            <w:tcW w:w="602" w:type="dxa"/>
+            <w:tcW w:w="536" w:type="dxa"/>
           </w:tcPr>
           <w:p>
             <w:pPr>
@@ -3154,7 +3173,7 @@
         </w:tc>
         <w:tc>
           <w:tcPr>
-            <w:tcW w:w="602" w:type="dxa"/>
+            <w:tcW w:w="536" w:type="dxa"/>
           </w:tcPr>
           <w:p>
             <w:pPr>
@@ -3258,7 +3277,7 @@
         </w:tc>
         <w:tc>
           <w:tcPr>
-            <w:tcW w:w="602" w:type="dxa"/>
+            <w:tcW w:w="536" w:type="dxa"/>
           </w:tcPr>
           <w:p>
             <w:pPr>
@@ -3362,7 +3381,7 @@
         </w:tc>
         <w:tc>
           <w:tcPr>
-            <w:tcW w:w="602" w:type="dxa"/>
+            <w:tcW w:w="536" w:type="dxa"/>
           </w:tcPr>
           <w:p>
             <w:pPr>
@@ -3466,7 +3485,7 @@
         </w:tc>
         <w:tc>
           <w:tcPr>
-            <w:tcW w:w="602" w:type="dxa"/>
+            <w:tcW w:w="536" w:type="dxa"/>
           </w:tcPr>
           <w:p>
             <w:pPr>
@@ -3570,7 +3589,7 @@
         </w:tc>
         <w:tc>
           <w:tcPr>
-            <w:tcW w:w="602" w:type="dxa"/>
+            <w:tcW w:w="536" w:type="dxa"/>
           </w:tcPr>
           <w:p>
             <w:pPr>
@@ -3674,7 +3693,7 @@
         </w:tc>
         <w:tc>
           <w:tcPr>
-            <w:tcW w:w="602" w:type="dxa"/>
+            <w:tcW w:w="536" w:type="dxa"/>
           </w:tcPr>
           <w:p>
             <w:pPr>
@@ -3746,7 +3765,39 @@
           <w:sz w:val="22"/>
           <w:szCs w:val="22"/>
         </w:rPr>
-        <w:t xml:space="preserve"> on my honor that the above is true and correct report of the hours of work performed, record of which was made daily at the time of arrival and departure from office.</w:t>
+        <w:t xml:space="preserve"> </w:t>
+      </w:r>
+      <w:proofErr w:type="gramStart"/>
+      <w:r>
+        <w:rPr>
+          <w:sz w:val="22"/>
+          <w:szCs w:val="22"/>
+        </w:rPr>
+        <w:t>on</w:t>
+      </w:r>
+      <w:proofErr w:type="gramEnd"/>
+      <w:r>
+        <w:rPr>
+          <w:sz w:val="22"/>
+          <w:szCs w:val="22"/>
+        </w:rPr>
+        <w:t xml:space="preserve"> my honor that the above is true and correct report of the hours of work </w:t>
+      </w:r>
+      <w:proofErr w:type="gramStart"/>
+      <w:r>
+        <w:rPr>
+          <w:sz w:val="22"/>
+          <w:szCs w:val="22"/>
+        </w:rPr>
+        <w:t>performed,</w:t>
+      </w:r>
+      <w:proofErr w:type="gramEnd"/>
+      <w:r>
+        <w:rPr>
+          <w:sz w:val="22"/>
+          <w:szCs w:val="22"/>
+        </w:rPr>
+        <w:t xml:space="preserve"> record of which was made daily at the time of arrival and departure from office.</w:t>
       </w:r>
     </w:p>
     <w:p>
@@ -3871,6 +3922,22 @@
           <w:szCs w:val="22"/>
         </w:rPr>
       </w:pPr>
+    </w:p>
+    <w:p>
+      <w:pPr>
+        <w:rPr>
+          <w:sz w:val="22"/>
+          <w:szCs w:val="22"/>
+        </w:rPr>
+      </w:pPr>
+    </w:p>
+    <w:p>
+      <w:pPr>
+        <w:rPr>
+          <w:sz w:val="22"/>
+          <w:szCs w:val="22"/>
+        </w:rPr>
+      </w:pPr>
       <w:r>
         <w:rPr>
           <w:sz w:val="22"/>
@@ -3881,6 +3948,7 @@
     </w:p>
     <w:p>
       <w:pPr>
+        <w:jc w:val="center"/>
         <w:rPr>
           <w:sz w:val="22"/>
           <w:szCs w:val="22"/>
@@ -3995,7 +4063,17 @@
           <w:szCs w:val="20"/>
           <w:u w:val="single"/>
         </w:rPr>
-        <w:t>{year}</w:t>
+        <w:t>{</w:t>
+      </w:r>
+      <w:proofErr w:type="gramStart"/>
+      <w:r>
+        <w:rPr>
+          <w:b/>
+          <w:sz w:val="20"/>
+          <w:szCs w:val="20"/>
+          <w:u w:val="single"/>
+        </w:rPr>
+        <w:t>year}</w:t>
       </w:r>
       <w:r>
         <w:rPr>
@@ -4011,6 +4089,7 @@
         </w:rPr>
         <w:t xml:space="preserve"> </w:t>
       </w:r>
+      <w:proofErr w:type="gramEnd"/>
       <w:r>
         <w:rPr>
           <w:sz w:val="20"/>
@@ -4189,6 +4268,7 @@
                 <w:szCs w:val="22"/>
               </w:rPr>
             </w:pPr>
+            <w:proofErr w:type="spellStart"/>
             <w:r>
               <w:rPr>
                 <w:sz w:val="22"/>
@@ -4196,6 +4276,7 @@
               </w:rPr>
               <w:t>Depar</w:t>
             </w:r>
+            <w:proofErr w:type="spellEnd"/>
           </w:p>
           <w:p>
             <w:pPr>
@@ -4205,6 +4286,7 @@
                 <w:szCs w:val="22"/>
               </w:rPr>
             </w:pPr>
+            <w:proofErr w:type="spellStart"/>
             <w:r>
               <w:rPr>
                 <w:sz w:val="22"/>
@@ -4212,6 +4294,7 @@
               </w:rPr>
               <w:t>ture</w:t>
             </w:r>
+            <w:proofErr w:type="spellEnd"/>
           </w:p>
         </w:tc>
         <w:tc>
@@ -4257,6 +4340,7 @@
                 <w:szCs w:val="22"/>
               </w:rPr>
             </w:pPr>
+            <w:proofErr w:type="spellStart"/>
             <w:r>
               <w:rPr>
                 <w:sz w:val="22"/>
@@ -4264,6 +4348,7 @@
               </w:rPr>
               <w:t>Depar</w:t>
             </w:r>
+            <w:proofErr w:type="spellEnd"/>
           </w:p>
           <w:p>
             <w:pPr>
@@ -4273,6 +4358,7 @@
                 <w:szCs w:val="22"/>
               </w:rPr>
             </w:pPr>
+            <w:proofErr w:type="spellStart"/>
             <w:r>
               <w:rPr>
                 <w:sz w:val="22"/>
@@ -4280,6 +4366,7 @@
               </w:rPr>
               <w:t>ture</w:t>
             </w:r>
+            <w:proofErr w:type="spellEnd"/>
           </w:p>
         </w:tc>
         <w:tc>
@@ -7619,7 +7706,39 @@
           <w:sz w:val="22"/>
           <w:szCs w:val="22"/>
         </w:rPr>
-        <w:t xml:space="preserve"> on my honor that the above is true and correct report of the hours of work performed, record of which was made daily at the time of arrival and departure from office.</w:t>
+        <w:t xml:space="preserve"> </w:t>
+      </w:r>
+      <w:proofErr w:type="gramStart"/>
+      <w:r>
+        <w:rPr>
+          <w:sz w:val="22"/>
+          <w:szCs w:val="22"/>
+        </w:rPr>
+        <w:t>on</w:t>
+      </w:r>
+      <w:proofErr w:type="gramEnd"/>
+      <w:r>
+        <w:rPr>
+          <w:sz w:val="22"/>
+          <w:szCs w:val="22"/>
+        </w:rPr>
+        <w:t xml:space="preserve"> my honor that the above is true and correct report of the hours of work </w:t>
+      </w:r>
+      <w:proofErr w:type="gramStart"/>
+      <w:r>
+        <w:rPr>
+          <w:sz w:val="22"/>
+          <w:szCs w:val="22"/>
+        </w:rPr>
+        <w:t>performed,</w:t>
+      </w:r>
+      <w:proofErr w:type="gramEnd"/>
+      <w:r>
+        <w:rPr>
+          <w:sz w:val="22"/>
+          <w:szCs w:val="22"/>
+        </w:rPr>
+        <w:t xml:space="preserve"> record of which was made daily at the time of arrival and departure from office.</w:t>
       </w:r>
     </w:p>
     <w:p>

</xml_diff>